<commit_message>
ACTUALIZO A MI COIDGO FINAL
</commit_message>
<xml_diff>
--- a/TRATAMIENTOS NOTACIONES.docx
+++ b/TRATAMIENTOS NOTACIONES.docx
@@ -347,14 +347,12 @@
         </w:rPr>
         <w:t xml:space="preserve">realizó el </w:t>
       </w:r>
-      <w:proofErr w:type="spellStart"/>
-      <w:r>
-        <w:rPr>
-          <w:lang w:val="es-419"/>
-        </w:rPr>
-        <w:t>calculo</w:t>
-      </w:r>
-      <w:proofErr w:type="spellEnd"/>
+      <w:r>
+        <w:rPr>
+          <w:lang w:val="es-419"/>
+        </w:rPr>
+        <w:t>cálculo</w:t>
+      </w:r>
       <w:r>
         <w:rPr>
           <w:lang w:val="es-419"/>
@@ -875,6 +873,7 @@
       </w:pPr>
       <w:r>
         <w:rPr>
+          <w:noProof/>
           <w:lang w:val="es-419"/>
         </w:rPr>
         <w:lastRenderedPageBreak/>

</xml_diff>